<commit_message>
feat: modele bon de reception mis a jour — signature « CHEF D'AGENCE »
Le document Word source a ete modifie par le gestionnaire : la signature de
droite est desormais « CHEF D'AGENCE » (au lieu de « DATE ET SIGNATURE A LA
RECEPTION »). Modele re-converti en PDF et fiches existantes regenerees.
</commit_message>
<xml_diff>
--- a/services/modeles/bon-de-reception.docx
+++ b/services/modeles/bon-de-reception.docx
@@ -243,7 +243,7 @@
                                     <pic:cNvPicPr/>
                                   </pic:nvPicPr>
                                   <pic:blipFill>
-                                    <a:blip r:embed="rId4">
+                                    <a:blip r:embed="rId5">
                                       <a:extLst>
                                         <a:ext uri="{28A0092B-C50C-407E-A947-70E740481C1C}">
                                           <a14:useLocalDpi xmlns:a14="http://schemas.microsoft.com/office/drawing/2010/main" val="0"/>
@@ -1155,7 +1155,112 @@
         <mc:AlternateContent>
           <mc:Choice Requires="wps">
             <w:drawing>
-              <wp:anchor distT="0" distB="0" distL="114300" distR="114300" simplePos="0" relativeHeight="251661312" behindDoc="0" locked="0" layoutInCell="1" allowOverlap="1" wp14:anchorId="6F94875E" wp14:editId="19205638">
+              <wp:anchor distT="0" distB="0" distL="114300" distR="114300" simplePos="0" relativeHeight="251663360" behindDoc="0" locked="0" layoutInCell="1" allowOverlap="1" wp14:anchorId="02A9B290" wp14:editId="5C0B3CBC">
+                <wp:simplePos x="0" y="0"/>
+                <wp:positionH relativeFrom="column">
+                  <wp:posOffset>2854960</wp:posOffset>
+                </wp:positionH>
+                <wp:positionV relativeFrom="paragraph">
+                  <wp:posOffset>403013</wp:posOffset>
+                </wp:positionV>
+                <wp:extent cx="3008630" cy="1278385"/>
+                <wp:effectExtent l="0" t="0" r="0" b="0"/>
+                <wp:wrapNone/>
+                <wp:docPr id="36362646" name="Zone de texte 8"/>
+                <wp:cNvGraphicFramePr/>
+                <a:graphic xmlns:a="http://schemas.openxmlformats.org/drawingml/2006/main">
+                  <a:graphicData uri="http://schemas.microsoft.com/office/word/2010/wordprocessingShape">
+                    <wps:wsp>
+                      <wps:cNvSpPr txBox="1"/>
+                      <wps:spPr>
+                        <a:xfrm>
+                          <a:off x="0" y="0"/>
+                          <a:ext cx="3008630" cy="1278385"/>
+                        </a:xfrm>
+                        <a:prstGeom prst="rect">
+                          <a:avLst/>
+                        </a:prstGeom>
+                        <a:noFill/>
+                        <a:ln w="6350">
+                          <a:noFill/>
+                        </a:ln>
+                      </wps:spPr>
+                      <wps:txbx>
+                        <w:txbxContent>
+                          <w:p>
+                            <w:pPr>
+                              <w:jc w:val="right"/>
+                              <w:rPr>
+                                <w:u w:val="single"/>
+                              </w:rPr>
+                            </w:pPr>
+                            <w:r>
+                              <w:rPr>
+                                <w:u w:val="single"/>
+                              </w:rPr>
+                              <w:t>CHEF D’AGENCE</w:t>
+                            </w:r>
+                          </w:p>
+                        </w:txbxContent>
+                      </wps:txbx>
+                      <wps:bodyPr rot="0" spcFirstLastPara="0" vertOverflow="overflow" horzOverflow="overflow" vert="horz" wrap="square" lIns="91440" tIns="45720" rIns="91440" bIns="45720" numCol="1" spcCol="0" rtlCol="0" fromWordArt="0" anchor="t" anchorCtr="0" forceAA="0" compatLnSpc="1">
+                        <a:prstTxWarp prst="textNoShape">
+                          <a:avLst/>
+                        </a:prstTxWarp>
+                        <a:noAutofit/>
+                      </wps:bodyPr>
+                    </wps:wsp>
+                  </a:graphicData>
+                </a:graphic>
+                <wp14:sizeRelH relativeFrom="margin">
+                  <wp14:pctWidth>0</wp14:pctWidth>
+                </wp14:sizeRelH>
+                <wp14:sizeRelV relativeFrom="margin">
+                  <wp14:pctHeight>0</wp14:pctHeight>
+                </wp14:sizeRelV>
+              </wp:anchor>
+            </w:drawing>
+          </mc:Choice>
+          <mc:Fallback>
+            <w:pict>
+              <v:shapetype w14:anchorId="02A9B290" id="_x0000_t202" coordsize="21600,21600" o:spt="202" path="m,l,21600r21600,l21600,xe">
+                <v:stroke joinstyle="miter"/>
+                <v:path gradientshapeok="t" o:connecttype="rect"/>
+              </v:shapetype>
+              <v:shape id="Zone de texte 8" o:spid="_x0000_s1028" type="#_x0000_t202" style="position:absolute;margin-left:224.8pt;margin-top:31.75pt;width:236.9pt;height:100.65pt;z-index:251663360;visibility:visible;mso-wrap-style:square;mso-width-percent:0;mso-height-percent:0;mso-wrap-distance-left:9pt;mso-wrap-distance-top:0;mso-wrap-distance-right:9pt;mso-wrap-distance-bottom:0;mso-position-horizontal:absolute;mso-position-horizontal-relative:text;mso-position-vertical:absolute;mso-position-vertical-relative:text;mso-width-percent:0;mso-height-percent:0;mso-width-relative:margin;mso-height-relative:margin;v-text-anchor:top" o:gfxdata="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" filled="f" stroked="f" strokeweight=".5pt">
+                <v:textbox>
+                  <w:txbxContent>
+                    <w:p>
+                      <w:pPr>
+                        <w:jc w:val="right"/>
+                        <w:rPr>
+                          <w:u w:val="single"/>
+                        </w:rPr>
+                      </w:pPr>
+                      <w:r>
+                        <w:rPr>
+                          <w:u w:val="single"/>
+                        </w:rPr>
+                        <w:t>CHEF D’AGENCE</w:t>
+                      </w:r>
+                    </w:p>
+                  </w:txbxContent>
+                </v:textbox>
+              </v:shape>
+            </w:pict>
+          </mc:Fallback>
+        </mc:AlternateContent>
+      </w:r>
+      <w:r>
+        <w:rPr>
+          <w:noProof/>
+          <w:sz w:val="36"/>
+          <w:szCs w:val="36"/>
+        </w:rPr>
+        <mc:AlternateContent>
+          <mc:Choice Requires="wps">
+            <w:drawing>
+              <wp:anchor distT="0" distB="0" distL="114300" distR="114300" simplePos="0" relativeHeight="251661312" behindDoc="0" locked="0" layoutInCell="1" allowOverlap="1" wp14:anchorId="6F94875E" wp14:editId="50D27CB1">
                 <wp:simplePos x="0" y="0"/>
                 <wp:positionH relativeFrom="column">
                   <wp:posOffset>-46990</wp:posOffset>
@@ -1222,7 +1327,7 @@
           </mc:Choice>
           <mc:Fallback>
             <w:pict>
-              <v:shape w14:anchorId="6F94875E" id="Zone de texte 8" o:spid="_x0000_s1028" type="#_x0000_t202" style="position:absolute;margin-left:-3.7pt;margin-top:26.4pt;width:169.95pt;height:92.95pt;z-index:251661312;visibility:visible;mso-wrap-style:square;mso-width-percent:0;mso-height-percent:0;mso-wrap-distance-left:9pt;mso-wrap-distance-top:0;mso-wrap-distance-right:9pt;mso-wrap-distance-bottom:0;mso-position-horizontal:absolute;mso-position-horizontal-relative:text;mso-position-vertical:absolute;mso-position-vertical-relative:text;mso-width-percent:0;mso-height-percent:0;mso-width-relative:margin;mso-height-relative:margin;v-text-anchor:top" o:gfxdata="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" filled="f" stroked="f" strokeweight=".5pt">
+              <v:shape w14:anchorId="6F94875E" id="_x0000_s1029" type="#_x0000_t202" style="position:absolute;margin-left:-3.7pt;margin-top:26.4pt;width:169.95pt;height:92.95pt;z-index:251661312;visibility:visible;mso-wrap-style:square;mso-width-percent:0;mso-height-percent:0;mso-wrap-distance-left:9pt;mso-wrap-distance-top:0;mso-wrap-distance-right:9pt;mso-wrap-distance-bottom:0;mso-position-horizontal:absolute;mso-position-horizontal-relative:text;mso-position-vertical:absolute;mso-position-vertical-relative:text;mso-width-percent:0;mso-height-percent:0;mso-width-relative:margin;mso-height-relative:margin;v-text-anchor:top" o:gfxdata="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" filled="f" stroked="f" strokeweight=".5pt">
                 <v:textbox>
                   <w:txbxContent>
                     <w:p>
@@ -1236,107 +1341,6 @@
                           <w:u w:val="single"/>
                         </w:rPr>
                         <w:t>GESTIONNAIRE DE STOCK</w:t>
-                      </w:r>
-                    </w:p>
-                  </w:txbxContent>
-                </v:textbox>
-              </v:shape>
-            </w:pict>
-          </mc:Fallback>
-        </mc:AlternateContent>
-      </w:r>
-      <w:r>
-        <w:rPr>
-          <w:noProof/>
-          <w:sz w:val="36"/>
-          <w:szCs w:val="36"/>
-        </w:rPr>
-        <mc:AlternateContent>
-          <mc:Choice Requires="wps">
-            <w:drawing>
-              <wp:anchor distT="0" distB="0" distL="114300" distR="114300" simplePos="0" relativeHeight="251663360" behindDoc="0" locked="0" layoutInCell="1" allowOverlap="1" wp14:anchorId="02A9B290" wp14:editId="16E0557C">
-                <wp:simplePos x="0" y="0"/>
-                <wp:positionH relativeFrom="column">
-                  <wp:posOffset>2854960</wp:posOffset>
-                </wp:positionH>
-                <wp:positionV relativeFrom="paragraph">
-                  <wp:posOffset>335642</wp:posOffset>
-                </wp:positionV>
-                <wp:extent cx="3008630" cy="1278385"/>
-                <wp:effectExtent l="0" t="0" r="0" b="0"/>
-                <wp:wrapNone/>
-                <wp:docPr id="36362646" name="Zone de texte 8"/>
-                <wp:cNvGraphicFramePr/>
-                <a:graphic xmlns:a="http://schemas.openxmlformats.org/drawingml/2006/main">
-                  <a:graphicData uri="http://schemas.microsoft.com/office/word/2010/wordprocessingShape">
-                    <wps:wsp>
-                      <wps:cNvSpPr txBox="1"/>
-                      <wps:spPr>
-                        <a:xfrm>
-                          <a:off x="0" y="0"/>
-                          <a:ext cx="3008630" cy="1278385"/>
-                        </a:xfrm>
-                        <a:prstGeom prst="rect">
-                          <a:avLst/>
-                        </a:prstGeom>
-                        <a:noFill/>
-                        <a:ln w="6350">
-                          <a:noFill/>
-                        </a:ln>
-                      </wps:spPr>
-                      <wps:txbx>
-                        <w:txbxContent>
-                          <w:p>
-                            <w:pPr>
-                              <w:jc w:val="right"/>
-                              <w:rPr>
-                                <w:u w:val="single"/>
-                              </w:rPr>
-                            </w:pPr>
-                            <w:r>
-                              <w:rPr>
-                                <w:u w:val="single"/>
-                              </w:rPr>
-                              <w:t>DATE ET SIGNATURE À LA RÉCEPTION</w:t>
-                            </w:r>
-                          </w:p>
-                        </w:txbxContent>
-                      </wps:txbx>
-                      <wps:bodyPr rot="0" spcFirstLastPara="0" vertOverflow="overflow" horzOverflow="overflow" vert="horz" wrap="square" lIns="91440" tIns="45720" rIns="91440" bIns="45720" numCol="1" spcCol="0" rtlCol="0" fromWordArt="0" anchor="t" anchorCtr="0" forceAA="0" compatLnSpc="1">
-                        <a:prstTxWarp prst="textNoShape">
-                          <a:avLst/>
-                        </a:prstTxWarp>
-                        <a:noAutofit/>
-                      </wps:bodyPr>
-                    </wps:wsp>
-                  </a:graphicData>
-                </a:graphic>
-                <wp14:sizeRelH relativeFrom="margin">
-                  <wp14:pctWidth>0</wp14:pctWidth>
-                </wp14:sizeRelH>
-                <wp14:sizeRelV relativeFrom="margin">
-                  <wp14:pctHeight>0</wp14:pctHeight>
-                </wp14:sizeRelV>
-              </wp:anchor>
-            </w:drawing>
-          </mc:Choice>
-          <mc:Fallback>
-            <w:pict>
-              <v:shape w14:anchorId="02A9B290" id="_x0000_s1029" type="#_x0000_t202" style="position:absolute;margin-left:224.8pt;margin-top:26.45pt;width:236.9pt;height:100.65pt;z-index:251663360;visibility:visible;mso-wrap-style:square;mso-width-percent:0;mso-height-percent:0;mso-wrap-distance-left:9pt;mso-wrap-distance-top:0;mso-wrap-distance-right:9pt;mso-wrap-distance-bottom:0;mso-position-horizontal:absolute;mso-position-horizontal-relative:text;mso-position-vertical:absolute;mso-position-vertical-relative:text;mso-width-percent:0;mso-height-percent:0;mso-width-relative:margin;mso-height-relative:margin;v-text-anchor:top" o:gfxdata="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" filled="f" stroked="f" strokeweight=".5pt">
-                <v:textbox>
-                  <w:txbxContent>
-                    <w:p>
-                      <w:pPr>
-                        <w:jc w:val="right"/>
-                        <w:rPr>
-                          <w:u w:val="single"/>
-                        </w:rPr>
-                      </w:pPr>
-                      <w:r>
-                        <w:rPr>
-                          <w:u w:val="single"/>
-                        </w:rPr>
-                        <w:t>DATE ET SIGNATURE À LA RÉCEPTION</w:t>
                       </w:r>
                     </w:p>
                   </w:txbxContent>

</xml_diff>

<commit_message>
fix: corrige le chevauchement des bons de reception/livraison + modele livraison dedie
Le modele bon-de-reception.pdf deploye avait perdu la ligne "N° 000"
au-dessus du titre lors d'une reconversion Word -> PDF, alors que le code
etait calibre pour ce layout : la reference ecrasait le titre, la date
ecrasait le libelle Destination, et le tableau des articles etait decale
d'une rangee (chevauchement + texte a cheval sur la ligne suivante).

- Remplace le modele par la version a jour (N° au-dessus du titre, titre
  souligne, tableau realigne)
- Bon de livraison : utilise desormais un modele PDF dedie (titre et
  signatures Gestionnaire/Fournisseur deja imprimes) au lieu de rectangles
  blancs par-dessus le modele de reception
- Colonne Unite : affiche toujours l'unite choisie par l'admin sur
  l'article, plus de "-" pour les unites generiques
- Troncature automatique des champs libres (destination, fournisseur)
  qui depasseraient la largeur imprimable
</commit_message>
<xml_diff>
--- a/services/modeles/bon-de-reception.docx
+++ b/services/modeles/bon-de-reception.docx
@@ -243,7 +243,7 @@
                                     <pic:cNvPicPr/>
                                   </pic:nvPicPr>
                                   <pic:blipFill>
-                                    <a:blip r:embed="rId5">
+                                    <a:blip r:embed="rId4">
                                       <a:extLst>
                                         <a:ext uri="{28A0092B-C50C-407E-A947-70E740481C1C}">
                                           <a14:useLocalDpi xmlns:a14="http://schemas.microsoft.com/office/drawing/2010/main" val="0"/>
@@ -468,6 +468,7 @@
           </w:tcPr>
           <w:p>
             <w:pPr>
+              <w:jc w:val="center"/>
               <w:rPr>
                 <w:sz w:val="36"/>
                 <w:szCs w:val="36"/>
@@ -481,6 +482,7 @@
           </w:tcPr>
           <w:p>
             <w:pPr>
+              <w:jc w:val="center"/>
               <w:rPr>
                 <w:sz w:val="36"/>
                 <w:szCs w:val="36"/>
@@ -494,6 +496,7 @@
           </w:tcPr>
           <w:p>
             <w:pPr>
+              <w:jc w:val="center"/>
               <w:rPr>
                 <w:sz w:val="36"/>
                 <w:szCs w:val="36"/>
@@ -507,6 +510,7 @@
           </w:tcPr>
           <w:p>
             <w:pPr>
+              <w:jc w:val="center"/>
               <w:rPr>
                 <w:sz w:val="36"/>
                 <w:szCs w:val="36"/>
@@ -522,6 +526,7 @@
           </w:tcPr>
           <w:p>
             <w:pPr>
+              <w:jc w:val="center"/>
               <w:rPr>
                 <w:sz w:val="36"/>
                 <w:szCs w:val="36"/>
@@ -535,6 +540,7 @@
           </w:tcPr>
           <w:p>
             <w:pPr>
+              <w:jc w:val="center"/>
               <w:rPr>
                 <w:sz w:val="36"/>
                 <w:szCs w:val="36"/>
@@ -548,6 +554,7 @@
           </w:tcPr>
           <w:p>
             <w:pPr>
+              <w:jc w:val="center"/>
               <w:rPr>
                 <w:sz w:val="36"/>
                 <w:szCs w:val="36"/>
@@ -561,6 +568,7 @@
           </w:tcPr>
           <w:p>
             <w:pPr>
+              <w:jc w:val="center"/>
               <w:rPr>
                 <w:sz w:val="36"/>
                 <w:szCs w:val="36"/>
@@ -576,6 +584,7 @@
           </w:tcPr>
           <w:p>
             <w:pPr>
+              <w:jc w:val="center"/>
               <w:rPr>
                 <w:sz w:val="36"/>
                 <w:szCs w:val="36"/>
@@ -589,6 +598,7 @@
           </w:tcPr>
           <w:p>
             <w:pPr>
+              <w:jc w:val="center"/>
               <w:rPr>
                 <w:sz w:val="36"/>
                 <w:szCs w:val="36"/>
@@ -602,6 +612,7 @@
           </w:tcPr>
           <w:p>
             <w:pPr>
+              <w:jc w:val="center"/>
               <w:rPr>
                 <w:sz w:val="36"/>
                 <w:szCs w:val="36"/>
@@ -615,6 +626,7 @@
           </w:tcPr>
           <w:p>
             <w:pPr>
+              <w:jc w:val="center"/>
               <w:rPr>
                 <w:sz w:val="36"/>
                 <w:szCs w:val="36"/>
@@ -630,6 +642,7 @@
           </w:tcPr>
           <w:p>
             <w:pPr>
+              <w:jc w:val="center"/>
               <w:rPr>
                 <w:sz w:val="36"/>
                 <w:szCs w:val="36"/>
@@ -643,6 +656,7 @@
           </w:tcPr>
           <w:p>
             <w:pPr>
+              <w:jc w:val="center"/>
               <w:rPr>
                 <w:sz w:val="36"/>
                 <w:szCs w:val="36"/>
@@ -656,6 +670,7 @@
           </w:tcPr>
           <w:p>
             <w:pPr>
+              <w:jc w:val="center"/>
               <w:rPr>
                 <w:sz w:val="36"/>
                 <w:szCs w:val="36"/>
@@ -669,6 +684,7 @@
           </w:tcPr>
           <w:p>
             <w:pPr>
+              <w:jc w:val="center"/>
               <w:rPr>
                 <w:sz w:val="36"/>
                 <w:szCs w:val="36"/>
@@ -684,6 +700,7 @@
           </w:tcPr>
           <w:p>
             <w:pPr>
+              <w:jc w:val="center"/>
               <w:rPr>
                 <w:sz w:val="36"/>
                 <w:szCs w:val="36"/>
@@ -697,6 +714,7 @@
           </w:tcPr>
           <w:p>
             <w:pPr>
+              <w:jc w:val="center"/>
               <w:rPr>
                 <w:sz w:val="36"/>
                 <w:szCs w:val="36"/>
@@ -710,6 +728,7 @@
           </w:tcPr>
           <w:p>
             <w:pPr>
+              <w:jc w:val="center"/>
               <w:rPr>
                 <w:sz w:val="36"/>
                 <w:szCs w:val="36"/>
@@ -723,6 +742,7 @@
           </w:tcPr>
           <w:p>
             <w:pPr>
+              <w:jc w:val="center"/>
               <w:rPr>
                 <w:sz w:val="36"/>
                 <w:szCs w:val="36"/>
@@ -738,6 +758,7 @@
           </w:tcPr>
           <w:p>
             <w:pPr>
+              <w:jc w:val="center"/>
               <w:rPr>
                 <w:sz w:val="36"/>
                 <w:szCs w:val="36"/>
@@ -751,6 +772,7 @@
           </w:tcPr>
           <w:p>
             <w:pPr>
+              <w:jc w:val="center"/>
               <w:rPr>
                 <w:sz w:val="36"/>
                 <w:szCs w:val="36"/>
@@ -764,6 +786,7 @@
           </w:tcPr>
           <w:p>
             <w:pPr>
+              <w:jc w:val="center"/>
               <w:rPr>
                 <w:sz w:val="36"/>
                 <w:szCs w:val="36"/>
@@ -777,6 +800,7 @@
           </w:tcPr>
           <w:p>
             <w:pPr>
+              <w:jc w:val="center"/>
               <w:rPr>
                 <w:sz w:val="36"/>
                 <w:szCs w:val="36"/>
@@ -792,6 +816,7 @@
           </w:tcPr>
           <w:p>
             <w:pPr>
+              <w:jc w:val="center"/>
               <w:rPr>
                 <w:sz w:val="36"/>
                 <w:szCs w:val="36"/>
@@ -805,6 +830,7 @@
           </w:tcPr>
           <w:p>
             <w:pPr>
+              <w:jc w:val="center"/>
               <w:rPr>
                 <w:sz w:val="36"/>
                 <w:szCs w:val="36"/>
@@ -818,6 +844,7 @@
           </w:tcPr>
           <w:p>
             <w:pPr>
+              <w:jc w:val="center"/>
               <w:rPr>
                 <w:sz w:val="36"/>
                 <w:szCs w:val="36"/>
@@ -831,6 +858,7 @@
           </w:tcPr>
           <w:p>
             <w:pPr>
+              <w:jc w:val="center"/>
               <w:rPr>
                 <w:sz w:val="36"/>
                 <w:szCs w:val="36"/>
@@ -846,6 +874,7 @@
           </w:tcPr>
           <w:p>
             <w:pPr>
+              <w:jc w:val="center"/>
               <w:rPr>
                 <w:sz w:val="36"/>
                 <w:szCs w:val="36"/>
@@ -859,6 +888,7 @@
           </w:tcPr>
           <w:p>
             <w:pPr>
+              <w:jc w:val="center"/>
               <w:rPr>
                 <w:sz w:val="36"/>
                 <w:szCs w:val="36"/>
@@ -872,6 +902,7 @@
           </w:tcPr>
           <w:p>
             <w:pPr>
+              <w:jc w:val="center"/>
               <w:rPr>
                 <w:sz w:val="36"/>
                 <w:szCs w:val="36"/>
@@ -885,6 +916,7 @@
           </w:tcPr>
           <w:p>
             <w:pPr>
+              <w:jc w:val="center"/>
               <w:rPr>
                 <w:sz w:val="36"/>
                 <w:szCs w:val="36"/>
@@ -900,6 +932,7 @@
           </w:tcPr>
           <w:p>
             <w:pPr>
+              <w:jc w:val="center"/>
               <w:rPr>
                 <w:sz w:val="36"/>
                 <w:szCs w:val="36"/>
@@ -913,6 +946,7 @@
           </w:tcPr>
           <w:p>
             <w:pPr>
+              <w:jc w:val="center"/>
               <w:rPr>
                 <w:sz w:val="36"/>
                 <w:szCs w:val="36"/>
@@ -926,6 +960,7 @@
           </w:tcPr>
           <w:p>
             <w:pPr>
+              <w:jc w:val="center"/>
               <w:rPr>
                 <w:sz w:val="36"/>
                 <w:szCs w:val="36"/>
@@ -939,6 +974,7 @@
           </w:tcPr>
           <w:p>
             <w:pPr>
+              <w:jc w:val="center"/>
               <w:rPr>
                 <w:sz w:val="36"/>
                 <w:szCs w:val="36"/>
@@ -954,6 +990,7 @@
           </w:tcPr>
           <w:p>
             <w:pPr>
+              <w:jc w:val="center"/>
               <w:rPr>
                 <w:sz w:val="36"/>
                 <w:szCs w:val="36"/>
@@ -967,6 +1004,7 @@
           </w:tcPr>
           <w:p>
             <w:pPr>
+              <w:jc w:val="center"/>
               <w:rPr>
                 <w:sz w:val="36"/>
                 <w:szCs w:val="36"/>
@@ -980,6 +1018,7 @@
           </w:tcPr>
           <w:p>
             <w:pPr>
+              <w:jc w:val="center"/>
               <w:rPr>
                 <w:sz w:val="36"/>
                 <w:szCs w:val="36"/>
@@ -993,6 +1032,7 @@
           </w:tcPr>
           <w:p>
             <w:pPr>
+              <w:jc w:val="center"/>
               <w:rPr>
                 <w:sz w:val="36"/>
                 <w:szCs w:val="36"/>
@@ -1008,6 +1048,7 @@
           </w:tcPr>
           <w:p>
             <w:pPr>
+              <w:jc w:val="center"/>
               <w:rPr>
                 <w:sz w:val="36"/>
                 <w:szCs w:val="36"/>
@@ -1021,6 +1062,7 @@
           </w:tcPr>
           <w:p>
             <w:pPr>
+              <w:jc w:val="center"/>
               <w:rPr>
                 <w:sz w:val="36"/>
                 <w:szCs w:val="36"/>
@@ -1034,6 +1076,7 @@
           </w:tcPr>
           <w:p>
             <w:pPr>
+              <w:jc w:val="center"/>
               <w:rPr>
                 <w:sz w:val="36"/>
                 <w:szCs w:val="36"/>
@@ -1047,6 +1090,7 @@
           </w:tcPr>
           <w:p>
             <w:pPr>
+              <w:jc w:val="center"/>
               <w:rPr>
                 <w:sz w:val="36"/>
                 <w:szCs w:val="36"/>
@@ -1062,6 +1106,7 @@
           </w:tcPr>
           <w:p>
             <w:pPr>
+              <w:jc w:val="center"/>
               <w:rPr>
                 <w:sz w:val="36"/>
                 <w:szCs w:val="36"/>
@@ -1075,6 +1120,7 @@
           </w:tcPr>
           <w:p>
             <w:pPr>
+              <w:jc w:val="center"/>
               <w:rPr>
                 <w:sz w:val="36"/>
                 <w:szCs w:val="36"/>
@@ -1088,6 +1134,7 @@
           </w:tcPr>
           <w:p>
             <w:pPr>
+              <w:jc w:val="center"/>
               <w:rPr>
                 <w:sz w:val="36"/>
                 <w:szCs w:val="36"/>
@@ -1101,6 +1148,7 @@
           </w:tcPr>
           <w:p>
             <w:pPr>
+              <w:jc w:val="center"/>
               <w:rPr>
                 <w:sz w:val="36"/>
                 <w:szCs w:val="36"/>
@@ -1155,13 +1203,13 @@
         <mc:AlternateContent>
           <mc:Choice Requires="wps">
             <w:drawing>
-              <wp:anchor distT="0" distB="0" distL="114300" distR="114300" simplePos="0" relativeHeight="251663360" behindDoc="0" locked="0" layoutInCell="1" allowOverlap="1" wp14:anchorId="02A9B290" wp14:editId="5C0B3CBC">
+              <wp:anchor distT="0" distB="0" distL="114300" distR="114300" simplePos="0" relativeHeight="251663360" behindDoc="0" locked="0" layoutInCell="1" allowOverlap="1" wp14:anchorId="02A9B290" wp14:editId="4EAD7D6C">
                 <wp:simplePos x="0" y="0"/>
                 <wp:positionH relativeFrom="column">
                   <wp:posOffset>2854960</wp:posOffset>
                 </wp:positionH>
                 <wp:positionV relativeFrom="paragraph">
-                  <wp:posOffset>403013</wp:posOffset>
+                  <wp:posOffset>410828</wp:posOffset>
                 </wp:positionV>
                 <wp:extent cx="3008630" cy="1278385"/>
                 <wp:effectExtent l="0" t="0" r="0" b="0"/>
@@ -1200,6 +1248,19 @@
                               </w:rPr>
                               <w:t>CHEF D’AGENCE</w:t>
                             </w:r>
+                            <w:r>
+                              <w:rPr>
+                                <w:u w:val="single"/>
+                              </w:rPr>
+                              <w:t xml:space="preserve"> OU DE SERVICE</w:t>
+                            </w:r>
+                            <w:r>
+                              <w:rPr>
+                                <w:u w:val="single"/>
+                              </w:rPr>
+                              <w:br/>
+                              <w:t>(DATE ET SIGNATURE)</w:t>
+                            </w:r>
                           </w:p>
                         </w:txbxContent>
                       </wps:txbx>
@@ -1223,11 +1284,7 @@
           </mc:Choice>
           <mc:Fallback>
             <w:pict>
-              <v:shapetype w14:anchorId="02A9B290" id="_x0000_t202" coordsize="21600,21600" o:spt="202" path="m,l,21600r21600,l21600,xe">
-                <v:stroke joinstyle="miter"/>
-                <v:path gradientshapeok="t" o:connecttype="rect"/>
-              </v:shapetype>
-              <v:shape id="Zone de texte 8" o:spid="_x0000_s1028" type="#_x0000_t202" style="position:absolute;margin-left:224.8pt;margin-top:31.75pt;width:236.9pt;height:100.65pt;z-index:251663360;visibility:visible;mso-wrap-style:square;mso-width-percent:0;mso-height-percent:0;mso-wrap-distance-left:9pt;mso-wrap-distance-top:0;mso-wrap-distance-right:9pt;mso-wrap-distance-bottom:0;mso-position-horizontal:absolute;mso-position-horizontal-relative:text;mso-position-vertical:absolute;mso-position-vertical-relative:text;mso-width-percent:0;mso-height-percent:0;mso-width-relative:margin;mso-height-relative:margin;v-text-anchor:top" o:gfxdata="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" filled="f" stroked="f" strokeweight=".5pt">
+              <v:shape w14:anchorId="02A9B290" id="Zone de texte 8" o:spid="_x0000_s1028" type="#_x0000_t202" style="position:absolute;margin-left:224.8pt;margin-top:32.35pt;width:236.9pt;height:100.65pt;z-index:251663360;visibility:visible;mso-wrap-style:square;mso-width-percent:0;mso-height-percent:0;mso-wrap-distance-left:9pt;mso-wrap-distance-top:0;mso-wrap-distance-right:9pt;mso-wrap-distance-bottom:0;mso-position-horizontal:absolute;mso-position-horizontal-relative:text;mso-position-vertical:absolute;mso-position-vertical-relative:text;mso-width-percent:0;mso-height-percent:0;mso-width-relative:margin;mso-height-relative:margin;v-text-anchor:top" o:gfxdata="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" filled="f" stroked="f" strokeweight=".5pt">
                 <v:textbox>
                   <w:txbxContent>
                     <w:p>
@@ -1242,6 +1299,19 @@
                           <w:u w:val="single"/>
                         </w:rPr>
                         <w:t>CHEF D’AGENCE</w:t>
+                      </w:r>
+                      <w:r>
+                        <w:rPr>
+                          <w:u w:val="single"/>
+                        </w:rPr>
+                        <w:t xml:space="preserve"> OU DE SERVICE</w:t>
+                      </w:r>
+                      <w:r>
+                        <w:rPr>
+                          <w:u w:val="single"/>
+                        </w:rPr>
+                        <w:br/>
+                        <w:t>(DATE ET SIGNATURE)</w:t>
                       </w:r>
                     </w:p>
                   </w:txbxContent>

</xml_diff>